<commit_message>
Record model IDs for first-stage labels and v2 re-labelling runs
Co-Authored-By: Claude Sonnet 5.5 <noreply@anthropic.com>
Claude-Session: https://claude.ai/code/session_011aZmoPyuUT34TyBPwawaPZ
</commit_message>
<xml_diff>
--- a/misq_note/hf/MANUSCRIPT_MISQ_v5.docx
+++ b/misq_note/hf/MANUSCRIPT_MISQ_v5.docx
@@ -238,7 +238,7 @@
         <w:t xml:space="preserve"> </w:t>
       </w:r>
       <w:r>
-        <w:t xml:space="preserve">Each post was classified by two independent runs of a large language model that received only the post text, for direction (escalation, de-escalation, mixed, other). The two runs are copies of one model [record model name, version and temperature]; their agreement (κ = 0.74 on the human-validation sample, 0.62–0.96 elsewhere) measures consistency. The first-stage analysis (Section 4.2) uses the first run’s labels (</w:t>
+        <w:t xml:space="preserve">Each post was classified by two independent runs of a large language model that received only the post text, for direction (escalation, de-escalation, mixed, other). The two runs are copies of one model (Anthropic’s Claude Sonnet 5.5, model ID claude-sonnet-5-5, run on 14 October 2026 through agent calls with default sampling settings; temperature was not set by us); their agreement (κ = 0.74 on the human-validation sample, 0.62–0.96 elsewhere) measures consistency. The first-stage analysis (Section 4.2) uses the first run’s labels (</w:t>
       </w:r>
       <w:r>
         <w:t xml:space="preserve">“</w:t>
@@ -1434,7 +1434,7 @@
           <w:iCs/>
           <w:i/>
         </w:rPr>
-        <w:t xml:space="preserve">Table 2. Agreement with the final human labels (191 war-period posts; humans label 41 escalation and 46 de-escalation). The model versions behind the runs are to be recorded [versions].</w:t>
+        <w:t xml:space="preserve">Table 2. Agreement with the final human labels (191 war-period posts; humans label 41 escalation and 46 de-escalation). Model IDs: opus claude-opus-5-5, sonnet claude-sonnet-5-5, haiku claude-haiku-5-5, sonnet repeat claude-sonnet-5-5; all run on 14 October 2026 with default sampling settings.</w:t>
       </w:r>
     </w:p>
     <w:p>
@@ -6369,7 +6369,7 @@
         <w:t xml:space="preserve">”</w:t>
       </w:r>
       <w:r>
-        <w:t xml:space="preserve">; ties (15 posts) were resolved by the largest run. [Record model names and versions.]</w:t>
+        <w:t xml:space="preserve">; ties (15 posts) were resolved by the largest run. The runs used claude-opus-5-5, claude-sonnet-5-5, claude-haiku-5-5 and claude-sonnet-5-5 (repeat) on 14 October 2026 with default sampling settings; the first-stage labels (model 1) were produced by claude-sonnet-5-5 on the same date.</w:t>
       </w:r>
     </w:p>
     <w:p>

</xml_diff>